<commit_message>
checkpoint: Try it: Telegram QR code, example prompts for newcomers, resolver confidence fix, knowledge doc PDF
Co-Authored-By: Claude Opus 5.5 <noreply@anthropic.com>
</commit_message>
<xml_diff>
--- a/docs/Agla-Station-Knowledge-Document.docx
+++ b/docs/Agla-Station-Knowledge-Document.docx
@@ -537,6 +537,68 @@
                 <w:sz w:val="19"/>
                 <w:szCs w:val="19"/>
               </w:rPr>
+              <w:t xml:space="preserve">Try the bot</w:t>
+            </w:r>
+          </w:p>
+        </w:tc>
+        <w:tc>
+          <w:tcPr>
+            <w:tcW w:type="dxa" w:w="7132"/>
+            <w:tcBorders>
+              <w:top w:val="single" w:color="E3CFC2" w:sz="4"/>
+              <w:left w:val="single" w:color="E3CFC2" w:sz="4"/>
+              <w:bottom w:val="single" w:color="E3CFC2" w:sz="4"/>
+              <w:right w:val="single" w:color="E3CFC2" w:sz="4"/>
+            </w:tcBorders>
+            <w:tcMar>
+              <w:top w:type="dxa" w:w="70"/>
+              <w:left w:type="dxa" w:w="110"/>
+              <w:bottom w:type="dxa" w:w="70"/>
+              <w:right w:type="dxa" w:w="110"/>
+            </w:tcMar>
+            <w:vAlign w:val="top"/>
+          </w:tcPr>
+          <w:p>
+            <w:pPr>
+              <w:spacing w:after="40"/>
+            </w:pPr>
+            <w:r>
+              <w:rPr>
+                <w:sz w:val="19"/>
+                <w:szCs w:val="19"/>
+              </w:rPr>
+              <w:t xml:space="preserve">t.me/agla_station_bot (Telegram)</w:t>
+            </w:r>
+          </w:p>
+        </w:tc>
+      </w:tr>
+      <w:tr>
+        <w:tc>
+          <w:tcPr>
+            <w:tcW w:type="dxa" w:w="2506"/>
+            <w:tcBorders>
+              <w:top w:val="single" w:color="E3CFC2" w:sz="4"/>
+              <w:left w:val="single" w:color="E3CFC2" w:sz="4"/>
+              <w:bottom w:val="single" w:color="E3CFC2" w:sz="4"/>
+              <w:right w:val="single" w:color="E3CFC2" w:sz="4"/>
+            </w:tcBorders>
+            <w:tcMar>
+              <w:top w:type="dxa" w:w="70"/>
+              <w:left w:type="dxa" w:w="110"/>
+              <w:bottom w:type="dxa" w:w="70"/>
+              <w:right w:type="dxa" w:w="110"/>
+            </w:tcMar>
+            <w:vAlign w:val="top"/>
+          </w:tcPr>
+          <w:p>
+            <w:pPr>
+              <w:spacing w:after="40"/>
+            </w:pPr>
+            <w:r>
+              <w:rPr>
+                <w:sz w:val="19"/>
+                <w:szCs w:val="19"/>
+              </w:rPr>
               <w:t xml:space="preserve">Demo video</w:t>
             </w:r>
           </w:p>
@@ -1377,7 +1439,7 @@
                 <w:sz w:val="19"/>
                 <w:szCs w:val="19"/>
               </w:rPr>
-              <w:t xml:space="preserve">Built in Claude Code over 20.7 hours (7.3 active): 125 human prompts, 850 Claude actions, 6 logged decisions</w:t>
+              <w:t xml:space="preserve">Built in Claude Code over 21.3 hours (7.9 active): 131 human prompts, 876 Claude actions, 6 logged decisions</w:t>
             </w:r>
           </w:p>
         </w:tc>
@@ -9571,7 +9633,7 @@
         <w:spacing w:after="120" w:line="276"/>
       </w:pPr>
       <w:r>
-        <w:t xml:space="preserve">The system was built in Claude Code (Claude Opus 5.5) following a phased plan, with the human making every product decision. Over 20.7 hours (7.3 active) the human sent 125 prompts, 42 of them one- or two-word confirmations, and Claude took 850 actions. The process was recorded as it happened.</w:t>
+        <w:t xml:space="preserve">The system was built in Claude Code (Claude Opus 5.5) following a phased plan, with the human making every product decision. Over 21.3 hours (7.9 active) the human sent 131 prompts, 43 of them one- or two-word confirmations, and Claude took 876 actions. The process was recorded as it happened.</w:t>
       </w:r>
     </w:p>
     <w:p>

</xml_diff>